<commit_message>
docs: apply 28/10 decisions on blocking questions and align build docs
- tools/decisions.py: 29 provisional decisions, printed as Clarifications in every spec
- M3: scoring weights 35/15/15/15/10/10, province as filter, new LOCATION fields
  night_shooting_allowed and rainy_months (spec, data model, schema, seed rebuilt)
- M2/M5: Article 13 deadlines counted in working days
- Screen specs: 22 stale field names fixed at the source
- AGENTS.md, constitution 2.0.0, plan/research/quickstart aligned with the built stack
- Build log hashes, MVP Alpha checklist draft, docs/test contract and test plan
</commit_message>
<xml_diff>
--- a/docs/word/data/04-data-model.docx
+++ b/docs/word/data/04-data-model.docx
@@ -16,7 +16,7 @@
         <w:pStyle w:val="FirstParagraph"/>
       </w:pPr>
       <w:r>
-        <w:t xml:space="preserve">46 tables, 313 columns. Every column is</w:t>
+        <w:t xml:space="preserve">46 tables, 315 columns. Every column is</w:t>
       </w:r>
       <w:r>
         <w:t xml:space="preserve"> </w:t>
@@ -14542,6 +14542,150 @@
                 <w:sz w:val="17"/>
               </w:rPr>
               <w:t xml:space="preserve">M3 §5.1 FR-002; M3 §5.2 BR-010</w:t>
+            </w:r>
+          </w:p>
+        </w:tc>
+      </w:tr>
+      <w:tr>
+        <w:tc>
+          <w:tcPr/>
+          <w:p>
+            <w:pPr>
+              <w:pStyle w:val="Compact"/>
+              <w:jc w:val="left"/>
+            </w:pPr>
+            <w:r>
+              <w:rPr>
+                <w:rStyle w:val="VerbatimChar"/>
+                <w:sz w:val="17"/>
+              </w:rPr>
+              <w:t xml:space="preserve">night_shooting_allowed</w:t>
+            </w:r>
+          </w:p>
+        </w:tc>
+        <w:tc>
+          <w:tcPr/>
+          <w:p>
+            <w:pPr>
+              <w:pStyle w:val="Compact"/>
+              <w:jc w:val="left"/>
+            </w:pPr>
+            <w:r>
+              <w:rPr>
+                <w:rStyle w:val="VerbatimChar"/>
+                <w:sz w:val="17"/>
+              </w:rPr>
+              <w:t xml:space="preserve">ENUM(yes, no, ask)</w:t>
+            </w:r>
+          </w:p>
+        </w:tc>
+        <w:tc>
+          <w:tcPr/>
+          <w:p>
+            <w:pPr>
+              <w:pStyle w:val="Compact"/>
+              <w:jc w:val="left"/>
+            </w:pPr>
+            <w:r>
+              <w:rPr>
+                <w:sz w:val="17"/>
+              </w:rPr>
+              <w:t xml:space="preserve">Opt</w:t>
+            </w:r>
+          </w:p>
+        </w:tc>
+        <w:tc>
+          <w:tcPr/>
+          <w:p>
+            <w:pPr>
+              <w:pStyle w:val="Compact"/>
+            </w:pPr>
+          </w:p>
+        </w:tc>
+        <w:tc>
+          <w:tcPr/>
+          <w:p>
+            <w:pPr>
+              <w:pStyle w:val="Compact"/>
+              <w:jc w:val="left"/>
+            </w:pPr>
+            <w:r>
+              <w:rPr>
+                <w:sz w:val="17"/>
+              </w:rPr>
+              <w:t xml:space="preserve">M3 §5.1 FR-002; M3 Clarifications Q3 (28/10/2026)</w:t>
+            </w:r>
+          </w:p>
+        </w:tc>
+      </w:tr>
+      <w:tr>
+        <w:tc>
+          <w:tcPr/>
+          <w:p>
+            <w:pPr>
+              <w:pStyle w:val="Compact"/>
+              <w:jc w:val="left"/>
+            </w:pPr>
+            <w:r>
+              <w:rPr>
+                <w:rStyle w:val="VerbatimChar"/>
+                <w:sz w:val="17"/>
+              </w:rPr>
+              <w:t xml:space="preserve">rainy_months</w:t>
+            </w:r>
+          </w:p>
+        </w:tc>
+        <w:tc>
+          <w:tcPr/>
+          <w:p>
+            <w:pPr>
+              <w:pStyle w:val="Compact"/>
+              <w:jc w:val="left"/>
+            </w:pPr>
+            <w:r>
+              <w:rPr>
+                <w:rStyle w:val="VerbatimChar"/>
+                <w:sz w:val="17"/>
+              </w:rPr>
+              <w:t xml:space="preserve">INTEGER[]</w:t>
+            </w:r>
+          </w:p>
+        </w:tc>
+        <w:tc>
+          <w:tcPr/>
+          <w:p>
+            <w:pPr>
+              <w:pStyle w:val="Compact"/>
+              <w:jc w:val="left"/>
+            </w:pPr>
+            <w:r>
+              <w:rPr>
+                <w:sz w:val="17"/>
+              </w:rPr>
+              <w:t xml:space="preserve">Opt</w:t>
+            </w:r>
+          </w:p>
+        </w:tc>
+        <w:tc>
+          <w:tcPr/>
+          <w:p>
+            <w:pPr>
+              <w:pStyle w:val="Compact"/>
+            </w:pPr>
+          </w:p>
+        </w:tc>
+        <w:tc>
+          <w:tcPr/>
+          <w:p>
+            <w:pPr>
+              <w:pStyle w:val="Compact"/>
+              <w:jc w:val="left"/>
+            </w:pPr>
+            <w:r>
+              <w:rPr>
+                <w:sz w:val="17"/>
+              </w:rPr>
+              <w:t xml:space="preserve">M3 §5.1 FR-002; M3 Clarifications Q3 (28/10/2026)</w:t>
             </w:r>
           </w:p>
         </w:tc>

</xml_diff>